<commit_message>
Hardening + guidance wave: scan-sync selftests, tutorial, protocol chapter, papers, fresh screenshots
Six scan-sync selftests (folio resolution incl. lowercase wylie
markers, folio-faithful split, IIIF thumb rewrite pinned to the
live-verified BDRC shape, non-IIIF refusal). In-app Help: 'Jump to
the Woodblock' tutorial + 'Text ↔ scan synchronization (protocol)'
guidelines chapter (markers are the authority; OCR locates, never
testifies; polite-guest thumbnail rule). White paper §7½; Technical
Paper docx restored from its own source (regen had briefly pointed
both docx at the white paper). All 20 pane screenshots re-shot;
gallery rebuilt.

Co-Authored-By: Claude Fable 5 <noreply@anthropic.com>
</commit_message>
<xml_diff>
--- a/docs/distribution/WHITE_PAPER.docx
+++ b/docs/distribution/WHITE_PAPER.docx
@@ -2,7 +2,7 @@
 <file path=word/document.xml><?xml version="1.0" encoding="utf-8"?>
 <w:document xmlns:w="http://schemas.openxmlformats.org/wordprocessingml/2006/main" xmlns:m="http://schemas.openxmlformats.org/officeDocument/2006/math" xmlns:r="http://schemas.openxmlformats.org/officeDocument/2006/relationships" xmlns:o="urn:schemas-microsoft-com:office:office" xmlns:v="urn:schemas-microsoft-com:vml" xmlns:w10="urn:schemas-microsoft-com:office:word" xmlns:a="http://schemas.openxmlformats.org/drawingml/2006/main" xmlns:pic="http://schemas.openxmlformats.org/drawingml/2006/picture" xmlns:wp="http://schemas.openxmlformats.org/drawingml/2006/wordprocessingDrawing">
   <w:body>
-    <w:bookmarkStart w:id="18" w:name="the-all-translation-tool-white-paper"/>
+    <w:bookmarkStart w:id="19" w:name="the-all-translation-tool-white-paper"/>
     <w:p>
       <w:pPr>
         <w:pStyle w:val="Heading1"/>
@@ -524,13 +524,13 @@
         <w:t xml:space="preserve"> </w:t>
       </w:r>
       <w:r>
-        <w:t xml:space="preserve">preserved canon on your own disk — 2,716 texts and 8.68 million</w:t>
-      </w:r>
-      <w:r>
-        <w:t xml:space="preserve"> </w:t>
-      </w:r>
-      <w:r>
-        <w:t xml:space="preserve">lines of the complete ACIP Release 6, browsable as a tree that</w:t>
+        <w:t xml:space="preserve">preserved canon on your own disk — 8,986 texts and 14 million</w:t>
+      </w:r>
+      <w:r>
+        <w:t xml:space="preserve"> </w:t>
+      </w:r>
+      <w:r>
+        <w:t xml:space="preserve">lines of the current public Kangyur, Tengyur, and Sungbum releases, browsable as a tree that</w:t>
       </w:r>
       <w:r>
         <w:t xml:space="preserve"> </w:t>
@@ -678,7 +678,61 @@
         <w:t xml:space="preserve"> </w:t>
       </w:r>
       <w:r>
-        <w:t xml:space="preserve">text and the actual carving of it — anywhere on earth.</w:t>
+        <w:t xml:space="preserve">text and the actual carving of it — anywhere on earth. Those same</w:t>
+      </w:r>
+      <w:r>
+        <w:t xml:space="preserve"> </w:t>
+      </w:r>
+      <w:r>
+        <w:t xml:space="preserve">woodblock pages can be swept for what the text alone cannot show:</w:t>
+      </w:r>
+      <w:r>
+        <w:t xml:space="preserve"> </w:t>
+      </w:r>
+      <w:r>
+        <w:t xml:space="preserve">every folio of a volume searched for miniatures and diagrams, the</w:t>
+      </w:r>
+      <w:r>
+        <w:t xml:space="preserve"> </w:t>
+      </w:r>
+      <w:r>
+        <w:t xml:space="preserve">candidates gathered into a gallery of crops with their page</w:t>
+      </w:r>
+      <w:r>
+        <w:t xml:space="preserve"> </w:t>
+      </w:r>
+      <w:r>
+        <w:t xml:space="preserve">provenance. Selecting a text in the Library now names its author</w:t>
+      </w:r>
+      <w:r>
+        <w:t xml:space="preserve"> </w:t>
+      </w:r>
+      <w:r>
+        <w:t xml:space="preserve">as a person, not a string — the author’s other works one click</w:t>
+      </w:r>
+      <w:r>
+        <w:t xml:space="preserve"> </w:t>
+      </w:r>
+      <w:r>
+        <w:t xml:space="preserve">away, with links out to the Buddhist Digital Resource Center’s</w:t>
+      </w:r>
+      <w:r>
+        <w:t xml:space="preserve"> </w:t>
+      </w:r>
+      <w:r>
+        <w:t xml:space="preserve">person record and a Treasury of Lives biography where one exists.</w:t>
+      </w:r>
+      <w:r>
+        <w:t xml:space="preserve"> </w:t>
+      </w:r>
+      <w:r>
+        <w:t xml:space="preserve">And the reader’s place is kept: close the app mid-folio and it</w:t>
+      </w:r>
+      <w:r>
+        <w:t xml:space="preserve"> </w:t>
+      </w:r>
+      <w:r>
+        <w:t xml:space="preserve">reopens exactly there — same text, same scroll, same cursor.</w:t>
       </w:r>
     </w:p>
     <w:p>
@@ -882,7 +936,62 @@
         <w:t xml:space="preserve"> </w:t>
       </w:r>
       <w:r>
-        <w:t xml:space="preserve">browsing. Sanskrit is a whole workbench: enter IAST, Devanagari, or</w:t>
+        <w:t xml:space="preserve">browsing. Where a term was taught aloud, the card links the moment</w:t>
+      </w:r>
+      <w:r>
+        <w:t xml:space="preserve"> </w:t>
+      </w:r>
+      <w:r>
+        <w:t xml:space="preserve">—</w:t>
+      </w:r>
+      <w:r>
+        <w:t xml:space="preserve"> </w:t>
+      </w:r>
+      <w:r>
+        <w:rPr>
+          <w:i/>
+          <w:iCs/>
+        </w:rPr>
+        <w:t xml:space="preserve">Geshe Michael teaching this term</w:t>
+      </w:r>
+      <w:r>
+        <w:t xml:space="preserve">, timecoded into the original</w:t>
+      </w:r>
+      <w:r>
+        <w:t xml:space="preserve"> </w:t>
+      </w:r>
+      <w:r>
+        <w:t xml:space="preserve">recordings of his own courses, and where the spoken word itself is</w:t>
+      </w:r>
+      <w:r>
+        <w:t xml:space="preserve"> </w:t>
+      </w:r>
+      <w:r>
+        <w:t xml:space="preserve">heard, that too; the recordings remain the authority, the links</w:t>
+      </w:r>
+      <w:r>
+        <w:t xml:space="preserve"> </w:t>
+      </w:r>
+      <w:r>
+        <w:t xml:space="preserve">only open them. Chandra Das’s classic dictionary opens inside the</w:t>
+      </w:r>
+      <w:r>
+        <w:t xml:space="preserve"> </w:t>
+      </w:r>
+      <w:r>
+        <w:t xml:space="preserve">app at the right page. An opt-in search row extends Gofer’s reach</w:t>
+      </w:r>
+      <w:r>
+        <w:t xml:space="preserve"> </w:t>
+      </w:r>
+      <w:r>
+        <w:t xml:space="preserve">to every document this Mac has indexed, each term probed as typed</w:t>
+      </w:r>
+      <w:r>
+        <w:t xml:space="preserve"> </w:t>
+      </w:r>
+      <w:r>
+        <w:t xml:space="preserve">and as Tibetan script. Sanskrit is a whole workbench: enter IAST, Devanagari, or</w:t>
       </w:r>
       <w:r>
         <w:t xml:space="preserve"> </w:t>
@@ -1844,7 +1953,7 @@
         <w:t xml:space="preserve"> </w:t>
       </w:r>
       <w:r>
-        <w:t xml:space="preserve">any change ships, and any user can run its built-in self-test — 84</w:t>
+        <w:t xml:space="preserve">any change ships, and any user can run its built-in self-test — 89</w:t>
       </w:r>
       <w:r>
         <w:t xml:space="preserve"> </w:t>
@@ -1865,8 +1974,222 @@
         <w:t xml:space="preserve">rather than implying certainty.</w:t>
       </w:r>
     </w:p>
+    <w:p>
+      <w:pPr>
+        <w:pStyle w:val="BodyText"/>
+      </w:pPr>
+      <w:r>
+        <w:t xml:space="preserve">The same honesty governs how the tool is tested. Every ported</w:t>
+      </w:r>
+      <w:r>
+        <w:t xml:space="preserve"> </w:t>
+      </w:r>
+      <w:r>
+        <w:t xml:space="preserve">engine answers to its original’s validation battery — thirty-eight</w:t>
+      </w:r>
+      <w:r>
+        <w:t xml:space="preserve"> </w:t>
+      </w:r>
+      <w:r>
+        <w:t xml:space="preserve">suites run on every build, and a port that fails its battery does</w:t>
+      </w:r>
+      <w:r>
+        <w:t xml:space="preserve"> </w:t>
+      </w:r>
+      <w:r>
+        <w:t xml:space="preserve">not ship. The application then tests itself: nearly a hundred</w:t>
+      </w:r>
+      <w:r>
+        <w:t xml:space="preserve"> </w:t>
+      </w:r>
+      <w:r>
+        <w:t xml:space="preserve">in-app checks exercise the real panes against the real dictionary,</w:t>
+      </w:r>
+      <w:r>
+        <w:t xml:space="preserve"> </w:t>
+      </w:r>
+      <w:r>
+        <w:t xml:space="preserve">and a mechanized click-through presses every button, toggle, and</w:t>
+      </w:r>
+      <w:r>
+        <w:t xml:space="preserve"> </w:t>
+      </w:r>
+      <w:r>
+        <w:t xml:space="preserve">menu on every pane and proves the app stays coherent. For the</w:t>
+      </w:r>
+      <w:r>
+        <w:t xml:space="preserve"> </w:t>
+      </w:r>
+      <w:r>
+        <w:t xml:space="preserve">human side, an eighteen-thousand-word User Manual — every pane,</w:t>
+      </w:r>
+      <w:r>
+        <w:t xml:space="preserve"> </w:t>
+      </w:r>
+      <w:r>
+        <w:t xml:space="preserve">every control, click by click — ships inside the Help window,</w:t>
+      </w:r>
+      <w:r>
+        <w:t xml:space="preserve"> </w:t>
+      </w:r>
+      <w:r>
+        <w:t xml:space="preserve">whose opening view now lists the entire tool: every chapter, every</w:t>
+      </w:r>
+      <w:r>
+        <w:t xml:space="preserve"> </w:t>
+      </w:r>
+      <w:r>
+        <w:t xml:space="preserve">control, grouped by pane, findable by scrolling when its name is</w:t>
+      </w:r>
+      <w:r>
+        <w:t xml:space="preserve"> </w:t>
+      </w:r>
+      <w:r>
+        <w:t xml:space="preserve">unknown. And when something does go wrong in the field, one menu</w:t>
+      </w:r>
+      <w:r>
+        <w:t xml:space="preserve"> </w:t>
+      </w:r>
+      <w:r>
+        <w:t xml:space="preserve">writes a complete diagnostic report — versions, data health, the</w:t>
+      </w:r>
+      <w:r>
+        <w:t xml:space="preserve"> </w:t>
+      </w:r>
+      <w:r>
+        <w:t xml:space="preserve">app’s own log — and another opens a pre-addressed problem report,</w:t>
+      </w:r>
+      <w:r>
+        <w:t xml:space="preserve"> </w:t>
+      </w:r>
+      <w:r>
+        <w:t xml:space="preserve">so a tester’s finding arrives ready to act on.</w:t>
+      </w:r>
+    </w:p>
     <w:bookmarkEnd w:id="15"/>
-    <w:bookmarkStart w:id="16" w:name="what-comes-next"/>
+    <w:bookmarkStart w:id="16" w:name="X07f50c5b704f167607e32f5c67bb595eb491077"/>
+    <w:p>
+      <w:pPr>
+        <w:pStyle w:val="Heading2"/>
+      </w:pPr>
+      <w:r>
+        <w:t xml:space="preserve">7½. Text ↔ woodblock synchronization (added August 13)</w:t>
+      </w:r>
+    </w:p>
+    <w:p>
+      <w:pPr>
+        <w:pStyle w:val="FirstParagraph"/>
+      </w:pPr>
+      <w:r>
+        <w:t xml:space="preserve">The suite now closes the loop between the digital text and the</w:t>
+      </w:r>
+      <w:r>
+        <w:t xml:space="preserve"> </w:t>
+      </w:r>
+      <w:r>
+        <w:t xml:space="preserve">carving it came from. Because the input centers preserved</w:t>
+      </w:r>
+      <w:r>
+        <w:t xml:space="preserve"> </w:t>
+      </w:r>
+      <w:r>
+        <w:t xml:space="preserve">@folio</w:t>
+      </w:r>
+      <w:r>
+        <w:t xml:space="preserve"> </w:t>
+      </w:r>
+      <w:r>
+        <w:t xml:space="preserve">markers and the woodblock’s own lineation (one typed line per</w:t>
+      </w:r>
+      <w:r>
+        <w:t xml:space="preserve"> </w:t>
+      </w:r>
+      <w:r>
+        <w:t xml:space="preserve">carved line), and because BDRC’s IIIF manifests label every scan</w:t>
+      </w:r>
+      <w:r>
+        <w:t xml:space="preserve"> </w:t>
+      </w:r>
+      <w:r>
+        <w:t xml:space="preserve">with its folio side, the mapping from a selected phrase to its</w:t>
+      </w:r>
+      <w:r>
+        <w:t xml:space="preserve"> </w:t>
+      </w:r>
+      <w:r>
+        <w:t xml:space="preserve">folio, line, and image is deterministic end to end. Optical</w:t>
+      </w:r>
+      <w:r>
+        <w:t xml:space="preserve"> </w:t>
+      </w:r>
+      <w:r>
+        <w:t xml:space="preserve">recognition is confined to the last inch — locating the words</w:t>
+      </w:r>
+      <w:r>
+        <w:t xml:space="preserve"> </w:t>
+      </w:r>
+      <w:r>
+        <w:t xml:space="preserve">within the line — and is never surfaced as text.</w:t>
+      </w:r>
+    </w:p>
+    <w:p>
+      <w:pPr>
+        <w:pStyle w:val="BodyText"/>
+      </w:pPr>
+      <w:r>
+        <w:t xml:space="preserve">On that foundation: a right-click jump from any text to the</w:t>
+      </w:r>
+      <w:r>
+        <w:t xml:space="preserve"> </w:t>
+      </w:r>
+      <w:r>
+        <w:t xml:space="preserve">reading panel, the keying workflow, or a full archive-grade scan</w:t>
+      </w:r>
+      <w:r>
+        <w:t xml:space="preserve"> </w:t>
+      </w:r>
+      <w:r>
+        <w:t xml:space="preserve">viewer (two levels, direct manipulation, a self-completing</w:t>
+      </w:r>
+      <w:r>
+        <w:t xml:space="preserve"> </w:t>
+      </w:r>
+      <w:r>
+        <w:t xml:space="preserve">thumbnail rail, display-only image adjustment for faint</w:t>
+      </w:r>
+      <w:r>
+        <w:t xml:space="preserve"> </w:t>
+      </w:r>
+      <w:r>
+        <w:t xml:space="preserve">carvings); a folio-named offline store shared by reading and</w:t>
+      </w:r>
+      <w:r>
+        <w:t xml:space="preserve"> </w:t>
+      </w:r>
+      <w:r>
+        <w:t xml:space="preserve">keying; folio-faithful per-side exports that cannot disagree with</w:t>
+      </w:r>
+      <w:r>
+        <w:t xml:space="preserve"> </w:t>
+      </w:r>
+      <w:r>
+        <w:t xml:space="preserve">the markers they derive from; and the same locate power inside</w:t>
+      </w:r>
+      <w:r>
+        <w:t xml:space="preserve"> </w:t>
+      </w:r>
+      <w:r>
+        <w:t xml:space="preserve">the keying room, where the typists’ line convention makes the</w:t>
+      </w:r>
+      <w:r>
+        <w:t xml:space="preserve"> </w:t>
+      </w:r>
+      <w:r>
+        <w:t xml:space="preserve">search order exact.</w:t>
+      </w:r>
+    </w:p>
+    <w:bookmarkEnd w:id="16"/>
+    <w:bookmarkStart w:id="17" w:name="what-comes-next"/>
     <w:p>
       <w:pPr>
         <w:pStyle w:val="Heading2"/>
@@ -2060,13 +2383,31 @@
           <w:b/>
           <w:bCs/>
         </w:rPr>
-        <w:t xml:space="preserve">Windows and Linux builds</w:t>
-      </w:r>
-      <w:r>
-        <w:t xml:space="preserve"> </w:t>
-      </w:r>
-      <w:r>
-        <w:t xml:space="preserve">for the input centers.</w:t>
+        <w:t xml:space="preserve">The Das dictionary, searchable.</w:t>
+      </w:r>
+      <w:r>
+        <w:t xml:space="preserve"> </w:t>
+      </w:r>
+      <w:r>
+        <w:t xml:space="preserve">The Project’s own licensed</w:t>
+      </w:r>
+      <w:r>
+        <w:t xml:space="preserve"> </w:t>
+      </w:r>
+      <w:r>
+        <w:t xml:space="preserve">electronic Sarat Chandra Das (purchased 2019) awaits re-download;</w:t>
+      </w:r>
+      <w:r>
+        <w:t xml:space="preserve"> </w:t>
+      </w:r>
+      <w:r>
+        <w:t xml:space="preserve">it will replace the page-image viewer with a fully searchable</w:t>
+      </w:r>
+      <w:r>
+        <w:t xml:space="preserve"> </w:t>
+      </w:r>
+      <w:r>
+        <w:t xml:space="preserve">layer.</w:t>
       </w:r>
     </w:p>
     <w:p>
@@ -2078,6 +2419,114 @@
         </w:numPr>
       </w:pPr>
       <w:r>
+        <w:rPr>
+          <w:b/>
+          <w:bCs/>
+        </w:rPr>
+        <w:t xml:space="preserve">The remaining author names.</w:t>
+      </w:r>
+      <w:r>
+        <w:t xml:space="preserve"> </w:t>
+      </w:r>
+      <w:r>
+        <w:t xml:space="preserve">A letter to the Buddhist Digital</w:t>
+      </w:r>
+      <w:r>
+        <w:t xml:space="preserve"> </w:t>
+      </w:r>
+      <w:r>
+        <w:t xml:space="preserve">Resource Center asks their help matching the last catalog authors</w:t>
+      </w:r>
+      <w:r>
+        <w:t xml:space="preserve"> </w:t>
+      </w:r>
+      <w:r>
+        <w:t xml:space="preserve">to their person records; the app already resolves 184 of 265</w:t>
+      </w:r>
+      <w:r>
+        <w:t xml:space="preserve"> </w:t>
+      </w:r>
+      <w:r>
+        <w:t xml:space="preserve">deterministically, every candidate verified against BDRC’s own</w:t>
+      </w:r>
+      <w:r>
+        <w:t xml:space="preserve"> </w:t>
+      </w:r>
+      <w:r>
+        <w:t xml:space="preserve">labels and never guessed.</w:t>
+      </w:r>
+    </w:p>
+    <w:p>
+      <w:pPr>
+        <w:pStyle w:val="Compact"/>
+        <w:numPr>
+          <w:ilvl w:val="0"/>
+          <w:numId w:val="1001"/>
+        </w:numPr>
+      </w:pPr>
+      <w:r>
+        <w:rPr>
+          <w:b/>
+          <w:bCs/>
+        </w:rPr>
+        <w:t xml:space="preserve">The teaching index grows.</w:t>
+      </w:r>
+      <w:r>
+        <w:t xml:space="preserve"> </w:t>
+      </w:r>
+      <w:r>
+        <w:t xml:space="preserve">The harvest of Geshe Michael’s</w:t>
+      </w:r>
+      <w:r>
+        <w:t xml:space="preserve"> </w:t>
+      </w:r>
+      <w:r>
+        <w:t xml:space="preserve">recorded courses continues (rate limits, not rights, set the</w:t>
+      </w:r>
+      <w:r>
+        <w:t xml:space="preserve"> </w:t>
+      </w:r>
+      <w:r>
+        <w:t xml:space="preserve">pace), and a pilot will transcribe the Project’s own audio</w:t>
+      </w:r>
+      <w:r>
+        <w:t xml:space="preserve"> </w:t>
+      </w:r>
+      <w:r>
+        <w:t xml:space="preserve">archive with the same provenance discipline.</w:t>
+      </w:r>
+    </w:p>
+    <w:p>
+      <w:pPr>
+        <w:pStyle w:val="Compact"/>
+        <w:numPr>
+          <w:ilvl w:val="0"/>
+          <w:numId w:val="1001"/>
+        </w:numPr>
+      </w:pPr>
+      <w:r>
+        <w:rPr>
+          <w:b/>
+          <w:bCs/>
+        </w:rPr>
+        <w:t xml:space="preserve">Windows and Linux builds</w:t>
+      </w:r>
+      <w:r>
+        <w:t xml:space="preserve"> </w:t>
+      </w:r>
+      <w:r>
+        <w:t xml:space="preserve">for the input centers.</w:t>
+      </w:r>
+    </w:p>
+    <w:p>
+      <w:pPr>
+        <w:pStyle w:val="Compact"/>
+        <w:numPr>
+          <w:ilvl w:val="0"/>
+          <w:numId w:val="1001"/>
+        </w:numPr>
+      </w:pPr>
+      <w:r>
         <w:t xml:space="preserve">Cataloging has been deliberately set aside as its own future</w:t>
       </w:r>
       <w:r>
@@ -2093,8 +2542,8 @@
         <w:t xml:space="preserve">cataloging toolchain is banked and waiting for it.</w:t>
       </w:r>
     </w:p>
-    <w:bookmarkEnd w:id="16"/>
-    <w:bookmarkStart w:id="17" w:name="how-to-get-it"/>
+    <w:bookmarkEnd w:id="17"/>
+    <w:bookmarkStart w:id="18" w:name="how-to-get-it"/>
     <w:p>
       <w:pPr>
         <w:pStyle w:val="Heading2"/>
@@ -2214,8 +2663,8 @@
         <w:t xml:space="preserve">exists to serve.</w:t>
       </w:r>
     </w:p>
-    <w:bookmarkEnd w:id="17"/>
     <w:bookmarkEnd w:id="18"/>
+    <w:bookmarkEnd w:id="19"/>
     <w:sectPr>
       <w:footnotePr>
         <w:numRestart w:val="eachSect"/>

</xml_diff>